<commit_message>
sync(platform): update hi3516 and rv1126 from build machine
</commit_message>
<xml_diff>
--- a/Hi3516/ipc_platform/third-party/html-中性/YinSi_itc.docx
+++ b/Hi3516/ipc_platform/third-party/html-中性/YinSi_itc.docx
@@ -13,6 +13,7 @@
           <w:lang w:val="en-US" w:eastAsia="zh-CN"/>
         </w:rPr>
       </w:pPr>
+      <w:bookmarkStart w:id="0" w:name="_GoBack"/>
       <w:r>
         <w:rPr>
           <w:rFonts w:hint="eastAsia" w:ascii="思源黑体" w:hAnsi="思源黑体" w:eastAsia="思源黑体" w:cs="思源黑体"/>
@@ -167,7 +168,79 @@
           <w:shd w:val="clear" w:color="auto" w:fill="auto"/>
           <w:lang w:val="en-US" w:eastAsia="zh-CN"/>
         </w:rPr>
-        <w:t>本隐私条款为摄像机管理后台条款的一部分。如您选择购买或使用我们开发或运营的软件产品和服务（本隐私条款中的软件产品特指“摄像机管理后台”），请阅读下文以详细了解您在使用软件产品的过程中我们将如何收集、处理以及使用用户信息。</w:t>
+        <w:t>本隐私条款为</w:t>
+      </w:r>
+      <w:r>
+        <w:rPr>
+          <w:rStyle w:val="11"/>
+          <w:rFonts w:hint="eastAsia" w:ascii="思源黑体" w:hAnsi="思源黑体" w:eastAsia="思源黑体" w:cs="思源黑体"/>
+          <w:b w:val="0"/>
+          <w:bCs/>
+          <w:i w:val="0"/>
+          <w:caps w:val="0"/>
+          <w:color w:val="auto"/>
+          <w:spacing w:val="0"/>
+          <w:sz w:val="18"/>
+          <w:szCs w:val="18"/>
+          <w:highlight w:val="none"/>
+          <w:shd w:val="clear" w:color="auto" w:fill="auto"/>
+          <w:lang w:val="en-US" w:eastAsia="zh-CN"/>
+        </w:rPr>
+        <w:t>摄像机管理后台</w:t>
+      </w:r>
+      <w:r>
+        <w:rPr>
+          <w:rStyle w:val="11"/>
+          <w:rFonts w:hint="eastAsia" w:ascii="思源黑体" w:hAnsi="思源黑体" w:eastAsia="思源黑体" w:cs="思源黑体"/>
+          <w:b w:val="0"/>
+          <w:bCs/>
+          <w:i w:val="0"/>
+          <w:caps w:val="0"/>
+          <w:color w:val="auto"/>
+          <w:spacing w:val="0"/>
+          <w:sz w:val="18"/>
+          <w:szCs w:val="18"/>
+          <w:highlight w:val="none"/>
+          <w:shd w:val="clear" w:color="auto" w:fill="auto"/>
+          <w:lang w:val="en-US" w:eastAsia="zh-CN"/>
+        </w:rPr>
+        <w:t>条款的一部分。如您选择购买或使用我们开发或运营的软件产品和服务（本隐私条款中的软件产品特指“</w:t>
+      </w:r>
+      <w:r>
+        <w:rPr>
+          <w:rStyle w:val="11"/>
+          <w:rFonts w:hint="eastAsia" w:ascii="思源黑体" w:hAnsi="思源黑体" w:eastAsia="思源黑体" w:cs="思源黑体"/>
+          <w:b w:val="0"/>
+          <w:bCs/>
+          <w:i w:val="0"/>
+          <w:caps w:val="0"/>
+          <w:color w:val="auto"/>
+          <w:spacing w:val="0"/>
+          <w:sz w:val="18"/>
+          <w:szCs w:val="18"/>
+          <w:highlight w:val="none"/>
+          <w:shd w:val="clear" w:color="auto" w:fill="auto"/>
+          <w:lang w:val="en-US" w:eastAsia="zh-CN"/>
+        </w:rPr>
+        <w:t>摄像机管理后台</w:t>
+      </w:r>
+      <w:r>
+        <w:rPr>
+          <w:rStyle w:val="11"/>
+          <w:rFonts w:hint="eastAsia" w:ascii="思源黑体" w:hAnsi="思源黑体" w:eastAsia="思源黑体" w:cs="思源黑体"/>
+          <w:b w:val="0"/>
+          <w:bCs/>
+          <w:i w:val="0"/>
+          <w:caps w:val="0"/>
+          <w:color w:val="auto"/>
+          <w:spacing w:val="0"/>
+          <w:sz w:val="18"/>
+          <w:szCs w:val="18"/>
+          <w:highlight w:val="none"/>
+          <w:shd w:val="clear" w:color="auto" w:fill="auto"/>
+          <w:lang w:val="en-US" w:eastAsia="zh-CN"/>
+        </w:rPr>
+        <w:t>”），请阅读下文以详细了解您在使用软件产品的过程中我们将如何收集、处理以及使用用户信息。</w:t>
       </w:r>
     </w:p>
     <w:p>
@@ -207,7 +280,43 @@
           <w:shd w:val="clear" w:color="auto" w:fill="auto"/>
           <w:lang w:val="en-US" w:eastAsia="zh-CN"/>
         </w:rPr>
-        <w:t>您下载、获取、安装或使用（包括但不限于注册或登录行为等）摄像机管理后台软件产品及服务，代表您已阅读并同意本隐私条款，了解、清楚并同意我们对本隐私条款所做的任何合理变更。</w:t>
+        <w:t>您下载、获取、安装或使用（包括但不限于注册或登录行为等）</w:t>
+      </w:r>
+      <w:r>
+        <w:rPr>
+          <w:rStyle w:val="11"/>
+          <w:rFonts w:hint="eastAsia" w:ascii="思源黑体" w:hAnsi="思源黑体" w:eastAsia="思源黑体" w:cs="思源黑体"/>
+          <w:b w:val="0"/>
+          <w:bCs/>
+          <w:i w:val="0"/>
+          <w:caps w:val="0"/>
+          <w:color w:val="auto"/>
+          <w:spacing w:val="0"/>
+          <w:sz w:val="18"/>
+          <w:szCs w:val="18"/>
+          <w:highlight w:val="none"/>
+          <w:shd w:val="clear" w:color="auto" w:fill="auto"/>
+          <w:lang w:val="en-US" w:eastAsia="zh-CN"/>
+        </w:rPr>
+        <w:t>摄像机管理后台</w:t>
+      </w:r>
+      <w:r>
+        <w:rPr>
+          <w:rStyle w:val="11"/>
+          <w:rFonts w:hint="eastAsia" w:ascii="思源黑体" w:hAnsi="思源黑体" w:eastAsia="思源黑体" w:cs="思源黑体"/>
+          <w:b w:val="0"/>
+          <w:bCs/>
+          <w:i w:val="0"/>
+          <w:caps w:val="0"/>
+          <w:color w:val="auto"/>
+          <w:spacing w:val="0"/>
+          <w:sz w:val="18"/>
+          <w:szCs w:val="18"/>
+          <w:highlight w:val="none"/>
+          <w:shd w:val="clear" w:color="auto" w:fill="auto"/>
+          <w:lang w:val="en-US" w:eastAsia="zh-CN"/>
+        </w:rPr>
+        <w:t>软件产品及服务，代表您已阅读并同意本隐私条款，了解、清楚并同意我们对本隐私条款所做的任何合理变更。</w:t>
       </w:r>
     </w:p>
     <w:p>
@@ -248,7 +357,45 @@
           <w:shd w:val="clear" w:color="auto" w:fill="auto"/>
           <w:lang w:val="en-US" w:eastAsia="zh-CN"/>
         </w:rPr>
-        <w:t>您选择使用摄像机管理后台软件产品及服务代表您已授权并同意我们在遵守相关法律法规及政府政策的前提下，收集、处理、和使用您的个人用户信息以及您在使用软件产品过程中所产生的所有信息文件。</w:t>
+        <w:t>您选择使用</w:t>
+      </w:r>
+      <w:r>
+        <w:rPr>
+          <w:rStyle w:val="11"/>
+          <w:rFonts w:hint="eastAsia" w:ascii="思源黑体" w:hAnsi="思源黑体" w:eastAsia="思源黑体" w:cs="思源黑体"/>
+          <w:b/>
+          <w:bCs w:val="0"/>
+          <w:i w:val="0"/>
+          <w:caps w:val="0"/>
+          <w:color w:val="auto"/>
+          <w:spacing w:val="0"/>
+          <w:sz w:val="18"/>
+          <w:szCs w:val="18"/>
+          <w:highlight w:val="none"/>
+          <w:u w:val="single"/>
+          <w:shd w:val="clear" w:color="auto" w:fill="auto"/>
+          <w:lang w:val="en-US" w:eastAsia="zh-CN"/>
+        </w:rPr>
+        <w:t>摄像机管理后台</w:t>
+      </w:r>
+      <w:r>
+        <w:rPr>
+          <w:rStyle w:val="11"/>
+          <w:rFonts w:hint="eastAsia" w:ascii="思源黑体" w:hAnsi="思源黑体" w:eastAsia="思源黑体" w:cs="思源黑体"/>
+          <w:b/>
+          <w:bCs w:val="0"/>
+          <w:i w:val="0"/>
+          <w:caps w:val="0"/>
+          <w:color w:val="auto"/>
+          <w:spacing w:val="0"/>
+          <w:sz w:val="18"/>
+          <w:szCs w:val="18"/>
+          <w:highlight w:val="none"/>
+          <w:u w:val="single"/>
+          <w:shd w:val="clear" w:color="auto" w:fill="auto"/>
+          <w:lang w:val="en-US" w:eastAsia="zh-CN"/>
+        </w:rPr>
+        <w:t>软件产品及服务代表您已授权并同意我们在遵守相关法律法规及政府政策的前提下，收集、处理、和使用您的个人用户信息以及您在使用软件产品过程中所产生的所有信息文件。</w:t>
       </w:r>
       <w:r>
         <w:rPr>
@@ -306,7 +453,43 @@
           <w:shd w:val="clear" w:color="auto" w:fill="auto"/>
           <w:lang w:val="en-US" w:eastAsia="zh-CN"/>
         </w:rPr>
-        <w:t>如果您不同意接受本隐私条款或我们对其所做的任何条款合理变更，您将无法使用摄像机管理后台及服务。如因本隐私条款发生纠纷，您同意以</w:t>
+        <w:t>如果您不同意接受本隐私条款或我们对其所做的任何条款合理变更，您将无法使用</w:t>
+      </w:r>
+      <w:r>
+        <w:rPr>
+          <w:rStyle w:val="11"/>
+          <w:rFonts w:hint="eastAsia" w:ascii="思源黑体" w:hAnsi="思源黑体" w:eastAsia="思源黑体" w:cs="思源黑体"/>
+          <w:b w:val="0"/>
+          <w:bCs/>
+          <w:i w:val="0"/>
+          <w:caps w:val="0"/>
+          <w:color w:val="auto"/>
+          <w:spacing w:val="0"/>
+          <w:sz w:val="18"/>
+          <w:szCs w:val="18"/>
+          <w:highlight w:val="none"/>
+          <w:shd w:val="clear" w:color="auto" w:fill="auto"/>
+          <w:lang w:val="en-US" w:eastAsia="zh-CN"/>
+        </w:rPr>
+        <w:t>摄像机管理后台</w:t>
+      </w:r>
+      <w:r>
+        <w:rPr>
+          <w:rStyle w:val="11"/>
+          <w:rFonts w:hint="eastAsia" w:ascii="思源黑体" w:hAnsi="思源黑体" w:eastAsia="思源黑体" w:cs="思源黑体"/>
+          <w:b w:val="0"/>
+          <w:bCs/>
+          <w:i w:val="0"/>
+          <w:caps w:val="0"/>
+          <w:color w:val="auto"/>
+          <w:spacing w:val="0"/>
+          <w:sz w:val="18"/>
+          <w:szCs w:val="18"/>
+          <w:highlight w:val="none"/>
+          <w:shd w:val="clear" w:color="auto" w:fill="auto"/>
+          <w:lang w:val="en-US" w:eastAsia="zh-CN"/>
+        </w:rPr>
+        <w:t>及服务。如因本隐私条款发生纠纷，您同意以</w:t>
       </w:r>
       <w:r>
         <w:rPr>
@@ -792,7 +975,43 @@
           <w:shd w:val="clear" w:color="auto" w:fill="auto"/>
           <w:lang w:val="en-US" w:eastAsia="zh-CN"/>
         </w:rPr>
-        <w:t>个人数据：本隐私条款所涉及的隐私信息是指因用户注册、登录等操作而提交并默认储存至摄像机管理后台中的个人用户信息（例如用户名、用户ID、手机号码等基本资料）、操作内容痕迹及用户在使用系统功能的过程中输入、存储或上传所有符合法律法规及其他法律规范要求的文本、图像、声音、视频及因联系我们时提供的个人数据，例如地址、邮政编码、姓名、护照或其他身份信息、人脸信息（用于实名认证或备案认证）、银行账户信息、电子邮箱、您的用户信息、行业、职位、签名或其他数据。</w:t>
+        <w:t>个人数据：本隐私条款所涉及的隐私信息是指因用户注册、登录等操作而提交并默认储存至</w:t>
+      </w:r>
+      <w:r>
+        <w:rPr>
+          <w:rStyle w:val="11"/>
+          <w:rFonts w:hint="eastAsia" w:ascii="思源黑体" w:hAnsi="思源黑体" w:eastAsia="思源黑体" w:cs="思源黑体"/>
+          <w:b w:val="0"/>
+          <w:bCs/>
+          <w:i w:val="0"/>
+          <w:caps w:val="0"/>
+          <w:color w:val="auto"/>
+          <w:spacing w:val="0"/>
+          <w:sz w:val="18"/>
+          <w:szCs w:val="18"/>
+          <w:highlight w:val="none"/>
+          <w:shd w:val="clear" w:color="auto" w:fill="auto"/>
+          <w:lang w:val="en-US" w:eastAsia="zh-CN"/>
+        </w:rPr>
+        <w:t>摄像机管理后台</w:t>
+      </w:r>
+      <w:r>
+        <w:rPr>
+          <w:rStyle w:val="11"/>
+          <w:rFonts w:hint="eastAsia" w:ascii="思源黑体" w:hAnsi="思源黑体" w:eastAsia="思源黑体" w:cs="思源黑体"/>
+          <w:b w:val="0"/>
+          <w:bCs/>
+          <w:i w:val="0"/>
+          <w:caps w:val="0"/>
+          <w:color w:val="auto"/>
+          <w:spacing w:val="0"/>
+          <w:sz w:val="18"/>
+          <w:szCs w:val="18"/>
+          <w:highlight w:val="none"/>
+          <w:shd w:val="clear" w:color="auto" w:fill="auto"/>
+          <w:lang w:val="en-US" w:eastAsia="zh-CN"/>
+        </w:rPr>
+        <w:t>中的个人用户信息（例如用户名、用户ID、手机号码等基本资料）、操作内容痕迹及用户在使用系统功能的过程中输入、存储或上传所有符合法律法规及其他法律规范要求的文本、图像、声音、视频及因联系我们时提供的个人数据，例如地址、邮政编码、姓名、护照或其他身份信息、人脸信息（用于实名认证或备案认证）、银行账户信息、电子邮箱、您的用户信息、行业、职位、签名或其他数据。</w:t>
       </w:r>
     </w:p>
     <w:p>
@@ -880,7 +1099,133 @@
           <w:shd w:val="clear" w:color="auto" w:fill="auto"/>
           <w:lang w:val="en-US" w:eastAsia="zh-CN"/>
         </w:rPr>
-        <w:t>摄像机管理后台的作用是让您更加便捷地通过浏览器或客户端软件控制网络摄像机，并通过浏览器设置网络摄像机参数、智能功能、音视频参数、图像参数等，您将通过登录摄像机管理后台以实现系统内的各项功能操作，除系统开发默认文件外，您所需的文件均须自行上传并储存至系统。您的个人用户信息将通过个人注册或后台管理员操作的方式存储至系统中。您在使用过程中，须使用账户密码登录个人用户并在摄像机管理后台界面中输入、存储、查阅或上传内容。我们需要收集您的上述数据才能运营，如您选择不提供上述运营所需的数据，则无法使用该产品或服务。</w:t>
+        <w:t>摄像机管理后台</w:t>
+      </w:r>
+      <w:r>
+        <w:rPr>
+          <w:rStyle w:val="11"/>
+          <w:rFonts w:hint="eastAsia" w:ascii="思源黑体" w:hAnsi="思源黑体" w:eastAsia="思源黑体" w:cs="思源黑体"/>
+          <w:b w:val="0"/>
+          <w:bCs/>
+          <w:i w:val="0"/>
+          <w:caps w:val="0"/>
+          <w:color w:val="auto"/>
+          <w:spacing w:val="0"/>
+          <w:sz w:val="18"/>
+          <w:szCs w:val="18"/>
+          <w:highlight w:val="none"/>
+          <w:shd w:val="clear" w:color="auto" w:fill="auto"/>
+          <w:lang w:val="en-US" w:eastAsia="zh-CN"/>
+        </w:rPr>
+        <w:t>的作用是</w:t>
+      </w:r>
+      <w:r>
+        <w:rPr>
+          <w:rStyle w:val="11"/>
+          <w:rFonts w:hint="eastAsia" w:ascii="思源黑体" w:hAnsi="思源黑体" w:eastAsia="思源黑体" w:cs="思源黑体"/>
+          <w:b w:val="0"/>
+          <w:bCs/>
+          <w:i w:val="0"/>
+          <w:caps w:val="0"/>
+          <w:color w:val="auto"/>
+          <w:spacing w:val="0"/>
+          <w:sz w:val="18"/>
+          <w:szCs w:val="18"/>
+          <w:highlight w:val="none"/>
+          <w:shd w:val="clear" w:color="auto" w:fill="auto"/>
+          <w:lang w:val="en-US" w:eastAsia="zh-CN"/>
+        </w:rPr>
+        <w:t>让您更加便捷地通过浏览器或客户端软件控制网络摄像机，并通过浏览器设置网络摄像机参数、智能功能、音视频参数、图像参数等</w:t>
+      </w:r>
+      <w:r>
+        <w:rPr>
+          <w:rStyle w:val="11"/>
+          <w:rFonts w:hint="eastAsia" w:ascii="思源黑体" w:hAnsi="思源黑体" w:eastAsia="思源黑体" w:cs="思源黑体"/>
+          <w:b w:val="0"/>
+          <w:bCs/>
+          <w:i w:val="0"/>
+          <w:caps w:val="0"/>
+          <w:color w:val="auto"/>
+          <w:spacing w:val="0"/>
+          <w:sz w:val="18"/>
+          <w:szCs w:val="18"/>
+          <w:highlight w:val="none"/>
+          <w:shd w:val="clear" w:color="auto" w:fill="auto"/>
+          <w:lang w:val="en-US" w:eastAsia="zh-CN"/>
+        </w:rPr>
+        <w:t>，您将通过登录</w:t>
+      </w:r>
+      <w:r>
+        <w:rPr>
+          <w:rStyle w:val="11"/>
+          <w:rFonts w:hint="eastAsia" w:ascii="思源黑体" w:hAnsi="思源黑体" w:eastAsia="思源黑体" w:cs="思源黑体"/>
+          <w:b w:val="0"/>
+          <w:bCs/>
+          <w:i w:val="0"/>
+          <w:caps w:val="0"/>
+          <w:color w:val="auto"/>
+          <w:spacing w:val="0"/>
+          <w:sz w:val="18"/>
+          <w:szCs w:val="18"/>
+          <w:highlight w:val="none"/>
+          <w:shd w:val="clear" w:color="auto" w:fill="auto"/>
+          <w:lang w:val="en-US" w:eastAsia="zh-CN"/>
+        </w:rPr>
+        <w:t>摄像机管理后台</w:t>
+      </w:r>
+      <w:r>
+        <w:rPr>
+          <w:rStyle w:val="11"/>
+          <w:rFonts w:hint="eastAsia" w:ascii="思源黑体" w:hAnsi="思源黑体" w:eastAsia="思源黑体" w:cs="思源黑体"/>
+          <w:b w:val="0"/>
+          <w:bCs/>
+          <w:i w:val="0"/>
+          <w:caps w:val="0"/>
+          <w:color w:val="auto"/>
+          <w:spacing w:val="0"/>
+          <w:sz w:val="18"/>
+          <w:szCs w:val="18"/>
+          <w:highlight w:val="none"/>
+          <w:shd w:val="clear" w:color="auto" w:fill="auto"/>
+          <w:lang w:val="en-US" w:eastAsia="zh-CN"/>
+        </w:rPr>
+        <w:t>以实现系统内的各项功能操作，除系统开发默认文件外，您所需的文件均须自行上传并储存至系统。您的个人用户信息将通过个人注册或后台管理员操作的方式存储至系统中。您在使用过程中，须使用账户密码登录个人用户并在</w:t>
+      </w:r>
+      <w:r>
+        <w:rPr>
+          <w:rStyle w:val="11"/>
+          <w:rFonts w:hint="eastAsia" w:ascii="思源黑体" w:hAnsi="思源黑体" w:eastAsia="思源黑体" w:cs="思源黑体"/>
+          <w:b w:val="0"/>
+          <w:bCs/>
+          <w:i w:val="0"/>
+          <w:caps w:val="0"/>
+          <w:color w:val="auto"/>
+          <w:spacing w:val="0"/>
+          <w:sz w:val="18"/>
+          <w:szCs w:val="18"/>
+          <w:highlight w:val="none"/>
+          <w:shd w:val="clear" w:color="auto" w:fill="auto"/>
+          <w:lang w:val="en-US" w:eastAsia="zh-CN"/>
+        </w:rPr>
+        <w:t>摄像机管理后台</w:t>
+      </w:r>
+      <w:r>
+        <w:rPr>
+          <w:rStyle w:val="11"/>
+          <w:rFonts w:hint="eastAsia" w:ascii="思源黑体" w:hAnsi="思源黑体" w:eastAsia="思源黑体" w:cs="思源黑体"/>
+          <w:b w:val="0"/>
+          <w:bCs/>
+          <w:i w:val="0"/>
+          <w:caps w:val="0"/>
+          <w:color w:val="auto"/>
+          <w:spacing w:val="0"/>
+          <w:sz w:val="18"/>
+          <w:szCs w:val="18"/>
+          <w:highlight w:val="none"/>
+          <w:shd w:val="clear" w:color="auto" w:fill="auto"/>
+          <w:lang w:val="en-US" w:eastAsia="zh-CN"/>
+        </w:rPr>
+        <w:t>界面中输入、存储、查阅或上传内容。我们需要收集您的上述数据才能运营，如您选择不提供上述运营所需的数据，则无法使用该产品或服务。</w:t>
       </w:r>
     </w:p>
     <w:p>
@@ -1159,25 +1504,25 @@
           <w:shd w:val="clear" w:color="auto" w:fill="auto"/>
           <w:lang w:val="en-US" w:eastAsia="zh-CN"/>
         </w:rPr>
-        <w:t>我们极力保护您的个人账户隐私。系统将通过完善系统中的设备状态监控、视频流分析配置、操作日志记录</w:t>
-      </w:r>
-      <w:r>
-        <w:rPr>
-          <w:rStyle w:val="11"/>
-          <w:rFonts w:hint="eastAsia" w:ascii="思源黑体" w:hAnsi="思源黑体" w:eastAsia="思源黑体" w:cs="思源黑体"/>
-          <w:b w:val="0"/>
-          <w:bCs/>
-          <w:i w:val="0"/>
-          <w:caps w:val="0"/>
-          <w:color w:val="auto"/>
-          <w:spacing w:val="0"/>
-          <w:sz w:val="18"/>
-          <w:szCs w:val="18"/>
-          <w:highlight w:val="none"/>
-          <w:shd w:val="clear" w:color="auto" w:fill="auto"/>
-          <w:lang w:val="en-US" w:eastAsia="zh-CN"/>
-        </w:rPr>
-        <w:t>等</w:t>
+        <w:t>我们极力保护您的个人账户隐私。系统将</w:t>
+      </w:r>
+      <w:r>
+        <w:rPr>
+          <w:rStyle w:val="11"/>
+          <w:rFonts w:hint="eastAsia" w:ascii="思源黑体" w:hAnsi="思源黑体" w:eastAsia="思源黑体" w:cs="思源黑体"/>
+          <w:b w:val="0"/>
+          <w:bCs/>
+          <w:i w:val="0"/>
+          <w:caps w:val="0"/>
+          <w:color w:val="auto"/>
+          <w:spacing w:val="0"/>
+          <w:sz w:val="18"/>
+          <w:szCs w:val="18"/>
+          <w:highlight w:val="none"/>
+          <w:shd w:val="clear" w:color="auto" w:fill="auto"/>
+          <w:lang w:val="en-US" w:eastAsia="zh-CN"/>
+        </w:rPr>
+        <w:t>通过完善系统中的设备状态监控、视频流分析配置、操作日志记录等</w:t>
       </w:r>
       <w:r>
         <w:rPr>
@@ -1283,7 +1628,43 @@
           <w:shd w:val="clear" w:color="auto" w:fill="auto"/>
           <w:lang w:val="en-US" w:eastAsia="zh-CN"/>
         </w:rPr>
-        <w:t>在系统平台创建注册个人账户后，您的用户信息将储存在系统中，您可以随时使用账号和密码登录系统平台并使用摄像机管理后台软件提供的用户功能。</w:t>
+        <w:t>在系统平台创建注册个人账户后，您的用户信息将储存在系统中，您可以随时使用账号和密码登录系统平台并使用</w:t>
+      </w:r>
+      <w:r>
+        <w:rPr>
+          <w:rStyle w:val="11"/>
+          <w:rFonts w:hint="eastAsia" w:ascii="思源黑体" w:hAnsi="思源黑体" w:eastAsia="思源黑体" w:cs="思源黑体"/>
+          <w:b w:val="0"/>
+          <w:bCs/>
+          <w:i w:val="0"/>
+          <w:caps w:val="0"/>
+          <w:color w:val="auto"/>
+          <w:spacing w:val="0"/>
+          <w:sz w:val="18"/>
+          <w:szCs w:val="18"/>
+          <w:highlight w:val="none"/>
+          <w:shd w:val="clear" w:color="auto" w:fill="auto"/>
+          <w:lang w:val="en-US" w:eastAsia="zh-CN"/>
+        </w:rPr>
+        <w:t>摄像机管理后台</w:t>
+      </w:r>
+      <w:r>
+        <w:rPr>
+          <w:rStyle w:val="11"/>
+          <w:rFonts w:hint="eastAsia" w:ascii="思源黑体" w:hAnsi="思源黑体" w:eastAsia="思源黑体" w:cs="思源黑体"/>
+          <w:b w:val="0"/>
+          <w:bCs/>
+          <w:i w:val="0"/>
+          <w:caps w:val="0"/>
+          <w:color w:val="auto"/>
+          <w:spacing w:val="0"/>
+          <w:sz w:val="18"/>
+          <w:szCs w:val="18"/>
+          <w:highlight w:val="none"/>
+          <w:shd w:val="clear" w:color="auto" w:fill="auto"/>
+          <w:lang w:val="en-US" w:eastAsia="zh-CN"/>
+        </w:rPr>
+        <w:t>软件提供的用户功能。</w:t>
       </w:r>
     </w:p>
     <w:p>
@@ -1915,45 +2296,7 @@
           <w:shd w:val="clear" w:color="auto" w:fill="auto"/>
           <w:lang w:val="en-US" w:eastAsia="zh-CN"/>
         </w:rPr>
-        <w:t>为了保障您的账户安全、会话连接稳定以及后台系统的安全风控，在您访问或使用摄像机管理后台时，系统会获取您用于访问</w:t>
-      </w:r>
-      <w:bookmarkStart w:id="0" w:name="_GoBack"/>
-      <w:bookmarkEnd w:id="0"/>
-      <w:r>
-        <w:rPr>
-          <w:rStyle w:val="11"/>
-          <w:rFonts w:hint="eastAsia" w:ascii="思源黑体" w:hAnsi="思源黑体" w:eastAsia="思源黑体" w:cs="思源黑体"/>
-          <w:b w:val="0"/>
-          <w:bCs/>
-          <w:i w:val="0"/>
-          <w:caps w:val="0"/>
-          <w:color w:val="auto"/>
-          <w:spacing w:val="0"/>
-          <w:sz w:val="18"/>
-          <w:szCs w:val="18"/>
-          <w:highlight w:val="none"/>
-          <w:shd w:val="clear" w:color="auto" w:fill="auto"/>
-          <w:lang w:val="en-US" w:eastAsia="zh-CN"/>
-        </w:rPr>
-        <w:t>的终端设备信息（如设备型号、操作系统版本、IP地址等）</w:t>
-      </w:r>
-      <w:r>
-        <w:rPr>
-          <w:rStyle w:val="11"/>
-          <w:rFonts w:hint="eastAsia" w:ascii="思源黑体" w:hAnsi="思源黑体" w:eastAsia="思源黑体" w:cs="思源黑体"/>
-          <w:b w:val="0"/>
-          <w:bCs/>
-          <w:i w:val="0"/>
-          <w:caps w:val="0"/>
-          <w:color w:val="auto"/>
-          <w:spacing w:val="0"/>
-          <w:sz w:val="18"/>
-          <w:szCs w:val="18"/>
-          <w:highlight w:val="none"/>
-          <w:shd w:val="clear" w:color="auto" w:fill="auto"/>
-          <w:lang w:val="en-US" w:eastAsia="zh-CN"/>
-        </w:rPr>
-        <w:t>。</w:t>
+        <w:t>为了保障您的账户安全、会话连接稳定以及后台系统的安全风控，在您访问或使用摄像机管理后台时，系统会获取您用于访问的终端设备信息（如设备型号、操作系统版本、IP地址等）。</w:t>
       </w:r>
     </w:p>
     <w:p>
@@ -2014,25 +2357,7 @@
           <w:shd w:val="clear" w:color="auto" w:fill="auto"/>
           <w:lang w:val="en-US" w:eastAsia="zh-CN"/>
         </w:rPr>
-        <w:t>为了各项业务功能能进行网络连接，我们会在您首次打开摄像机管理后台时申请访问无线局域网及蜂窝移动数据</w:t>
-      </w:r>
-      <w:r>
-        <w:rPr>
-          <w:rStyle w:val="11"/>
-          <w:rFonts w:hint="eastAsia" w:ascii="思源黑体" w:hAnsi="思源黑体" w:eastAsia="思源黑体" w:cs="思源黑体"/>
-          <w:b w:val="0"/>
-          <w:bCs/>
-          <w:i w:val="0"/>
-          <w:caps w:val="0"/>
-          <w:color w:val="auto"/>
-          <w:spacing w:val="0"/>
-          <w:sz w:val="18"/>
-          <w:szCs w:val="18"/>
-          <w:highlight w:val="none"/>
-          <w:shd w:val="clear" w:color="auto" w:fill="auto"/>
-          <w:lang w:val="en-US" w:eastAsia="zh-CN"/>
-        </w:rPr>
-        <w:t>。</w:t>
+        <w:t>为了各项业务功能能进行网络连接，我们会在您首次打开摄像机管理后台时申请访问无线局域网及蜂窝移动数据。</w:t>
       </w:r>
     </w:p>
     <w:p>
@@ -2093,25 +2418,7 @@
           <w:shd w:val="clear" w:color="auto" w:fill="auto"/>
           <w:lang w:val="en-US" w:eastAsia="zh-CN"/>
         </w:rPr>
-        <w:t>为向您提供双向对讲、现场喊话等服务，我们会在您首次使用这些服务时申请获取麦克风访问权限</w:t>
-      </w:r>
-      <w:r>
-        <w:rPr>
-          <w:rStyle w:val="11"/>
-          <w:rFonts w:hint="eastAsia" w:ascii="思源黑体" w:hAnsi="思源黑体" w:eastAsia="思源黑体" w:cs="思源黑体"/>
-          <w:b w:val="0"/>
-          <w:bCs/>
-          <w:i w:val="0"/>
-          <w:caps w:val="0"/>
-          <w:color w:val="auto"/>
-          <w:spacing w:val="0"/>
-          <w:sz w:val="18"/>
-          <w:szCs w:val="18"/>
-          <w:highlight w:val="none"/>
-          <w:shd w:val="clear" w:color="auto" w:fill="auto"/>
-          <w:lang w:val="en-US" w:eastAsia="zh-CN"/>
-        </w:rPr>
-        <w:t>。</w:t>
+        <w:t>为向您提供双向对讲、现场喊话等服务，我们会在您首次使用这些服务时申请获取麦克风访问权限。</w:t>
       </w:r>
     </w:p>
     <w:p>
@@ -2172,25 +2479,7 @@
           <w:shd w:val="clear" w:color="auto" w:fill="auto"/>
           <w:lang w:val="en-US" w:eastAsia="zh-CN"/>
         </w:rPr>
-        <w:t>为向您提供视频录像导出、设备截图保存、以及本地文件上传服务，我们会在您首次使用这些服务时申请获取外部存储空间访问权限</w:t>
-      </w:r>
-      <w:r>
-        <w:rPr>
-          <w:rStyle w:val="11"/>
-          <w:rFonts w:hint="eastAsia" w:ascii="思源黑体" w:hAnsi="思源黑体" w:eastAsia="思源黑体" w:cs="思源黑体"/>
-          <w:b w:val="0"/>
-          <w:bCs/>
-          <w:i w:val="0"/>
-          <w:caps w:val="0"/>
-          <w:color w:val="auto"/>
-          <w:spacing w:val="0"/>
-          <w:sz w:val="18"/>
-          <w:szCs w:val="18"/>
-          <w:highlight w:val="none"/>
-          <w:shd w:val="clear" w:color="auto" w:fill="auto"/>
-          <w:lang w:val="en-US" w:eastAsia="zh-CN"/>
-        </w:rPr>
-        <w:t>。</w:t>
+        <w:t>为向您提供视频录像导出、设备截图保存、以及本地文件上传服务，我们会在您首次使用这些服务时申请获取外部存储空间访问权限。</w:t>
       </w:r>
     </w:p>
     <w:p>
@@ -2276,43 +2565,7 @@
           <w:shd w:val="clear" w:color="auto" w:fill="auto"/>
           <w:lang w:val="en-US" w:eastAsia="zh-CN"/>
         </w:rPr>
-        <w:t>我们仅在为提供“</w:t>
-      </w:r>
-      <w:r>
-        <w:rPr>
-          <w:rStyle w:val="11"/>
-          <w:rFonts w:hint="eastAsia" w:ascii="思源黑体" w:hAnsi="思源黑体" w:eastAsia="思源黑体" w:cs="思源黑体"/>
-          <w:b w:val="0"/>
-          <w:bCs/>
-          <w:i w:val="0"/>
-          <w:caps w:val="0"/>
-          <w:color w:val="auto"/>
-          <w:spacing w:val="0"/>
-          <w:sz w:val="18"/>
-          <w:szCs w:val="18"/>
-          <w:highlight w:val="none"/>
-          <w:shd w:val="clear" w:color="auto" w:fill="auto"/>
-          <w:lang w:val="en-US" w:eastAsia="zh-CN"/>
-        </w:rPr>
-        <w:t>摄像机管理后台</w:t>
-      </w:r>
-      <w:r>
-        <w:rPr>
-          <w:rStyle w:val="11"/>
-          <w:rFonts w:hint="eastAsia" w:ascii="思源黑体" w:hAnsi="思源黑体" w:eastAsia="思源黑体" w:cs="思源黑体"/>
-          <w:b w:val="0"/>
-          <w:bCs/>
-          <w:i w:val="0"/>
-          <w:caps w:val="0"/>
-          <w:color w:val="auto"/>
-          <w:spacing w:val="0"/>
-          <w:sz w:val="18"/>
-          <w:szCs w:val="18"/>
-          <w:highlight w:val="none"/>
-          <w:shd w:val="clear" w:color="auto" w:fill="auto"/>
-          <w:lang w:val="en-US" w:eastAsia="zh-CN"/>
-        </w:rPr>
-        <w:t>”产品及服务之目的所必需的期间内保留您的个人信息：</w:t>
+        <w:t>我们仅在为提供“摄像机管理后台”产品及服务之目的所必需的期间内保留您的个人信息：</w:t>
       </w:r>
     </w:p>
     <w:p>
@@ -3103,7 +3356,43 @@
           <w:shd w:val="clear" w:color="auto" w:fill="auto"/>
           <w:lang w:val="en-US" w:eastAsia="zh-CN"/>
         </w:rPr>
-        <w:t>我们的系统网络采用局域网形式来保护您在传输过程中的数据，以防止用户被技术篡改和被攻击而导致隐私文件泄露，确保您的用户数据（包括个人账户、密码及账户内包含的数据信息）在传输过程中的安全，保证用户信息文件的安全性，防止您在使用摄像机管理后台软件过程中的用户信息遭到未经授权的访问、使用、修改、损坏或丢失。</w:t>
+        <w:t>我们的系统网络采用局域网形式来保护您在传输过程中的数据，以防止用户被技术篡改和被攻击而导致隐私文件泄露，确保您的用户数据（包括个人账户、密码及账户内包含的数据信息）在传输过程中的安全，保证用户信息文件的安全性，防止您在使用</w:t>
+      </w:r>
+      <w:r>
+        <w:rPr>
+          <w:rStyle w:val="11"/>
+          <w:rFonts w:hint="eastAsia" w:ascii="思源黑体" w:hAnsi="思源黑体" w:eastAsia="思源黑体" w:cs="思源黑体"/>
+          <w:b w:val="0"/>
+          <w:bCs/>
+          <w:i w:val="0"/>
+          <w:caps w:val="0"/>
+          <w:color w:val="auto"/>
+          <w:spacing w:val="0"/>
+          <w:sz w:val="18"/>
+          <w:szCs w:val="18"/>
+          <w:highlight w:val="none"/>
+          <w:shd w:val="clear" w:color="auto" w:fill="auto"/>
+          <w:lang w:val="en-US" w:eastAsia="zh-CN"/>
+        </w:rPr>
+        <w:t>摄像机管理后台</w:t>
+      </w:r>
+      <w:r>
+        <w:rPr>
+          <w:rStyle w:val="11"/>
+          <w:rFonts w:hint="eastAsia" w:ascii="思源黑体" w:hAnsi="思源黑体" w:eastAsia="思源黑体" w:cs="思源黑体"/>
+          <w:b w:val="0"/>
+          <w:bCs/>
+          <w:i w:val="0"/>
+          <w:caps w:val="0"/>
+          <w:color w:val="auto"/>
+          <w:spacing w:val="0"/>
+          <w:sz w:val="18"/>
+          <w:szCs w:val="18"/>
+          <w:highlight w:val="none"/>
+          <w:shd w:val="clear" w:color="auto" w:fill="auto"/>
+          <w:lang w:val="en-US" w:eastAsia="zh-CN"/>
+        </w:rPr>
+        <w:t>软件过程中的用户信息遭到未经授权的访问、使用、修改、损坏或丢失。</w:t>
       </w:r>
     </w:p>
     <w:p>
@@ -3705,6 +3994,7 @@
         <w:t>日</w:t>
       </w:r>
     </w:p>
+    <w:bookmarkEnd w:id="0"/>
     <w:sectPr>
       <w:headerReference r:id="rId3" w:type="default"/>
       <w:pgSz w:w="11906" w:h="16838"/>

</xml_diff>